<commit_message>
alteraçao na certidao LP
</commit_message>
<xml_diff>
--- a/src/template/certidao_lp.docx
+++ b/src/template/certidao_lp.docx
@@ -507,8 +507,6 @@
         </w:rPr>
         <w:t>6</w:t>
       </w:r>
-      <w:bookmarkStart w:id="0" w:name="_GoBack"/>
-      <w:bookmarkEnd w:id="0"/>
       <w:r>
         <w:rPr>
           <w:b/>
@@ -663,32 +661,146 @@
         </w:rPr>
         <w:t xml:space="preserve"> mat</w:t>
       </w:r>
+      <w:r>
+        <w:rPr>
+          <w:rFonts w:ascii="Times New Roman" w:hAnsi="Times New Roman"/>
+          <w:sz w:val="24"/>
+          <w:szCs w:val="24"/>
+          <w:lang w:val="pt-BR"/>
+        </w:rPr>
+        <w:t>rícula</w:t>
+      </w:r>
+      <w:r>
+        <w:rPr>
+          <w:rFonts w:ascii="Times New Roman" w:hAnsi="Times New Roman"/>
+          <w:sz w:val="24"/>
+          <w:szCs w:val="24"/>
+        </w:rPr>
+        <w:t xml:space="preserve"> n°</w:t>
+      </w:r>
+      <w:r>
+        <w:rPr>
+          <w:rFonts w:ascii="Times New Roman" w:hAnsi="Times New Roman"/>
+          <w:sz w:val="24"/>
+          <w:szCs w:val="24"/>
+          <w:lang w:val="pt-BR"/>
+        </w:rPr>
+        <w:t xml:space="preserve"> </w:t>
+      </w:r>
+      <w:r>
+        <w:rPr>
+          <w:rFonts w:ascii="Times New Roman" w:hAnsi="Times New Roman"/>
+          <w:color w:val="FF0000"/>
+          <w:sz w:val="24"/>
+          <w:szCs w:val="24"/>
+          <w:lang w:val="pt-BR"/>
+        </w:rPr>
+        <w:t>{</w:t>
+      </w:r>
       <w:proofErr w:type="spellStart"/>
       <w:r>
         <w:rPr>
           <w:rFonts w:ascii="Times New Roman" w:hAnsi="Times New Roman"/>
+          <w:color w:val="FF0000"/>
           <w:sz w:val="24"/>
           <w:szCs w:val="24"/>
           <w:lang w:val="pt-BR"/>
         </w:rPr>
-        <w:t>rícula</w:t>
+        <w:t>matricula_certidao</w:t>
       </w:r>
       <w:proofErr w:type="spellEnd"/>
       <w:r>
         <w:rPr>
           <w:rFonts w:ascii="Times New Roman" w:hAnsi="Times New Roman"/>
-          <w:sz w:val="24"/>
-          <w:szCs w:val="24"/>
-        </w:rPr>
-        <w:t xml:space="preserve"> n°</w:t>
-      </w:r>
-      <w:r>
-        <w:rPr>
-          <w:rFonts w:ascii="Times New Roman" w:hAnsi="Times New Roman"/>
+          <w:color w:val="FF0000"/>
           <w:sz w:val="24"/>
           <w:szCs w:val="24"/>
           <w:lang w:val="pt-BR"/>
         </w:rPr>
+        <w:t>}</w:t>
+      </w:r>
+      <w:r>
+        <w:rPr>
+          <w:rFonts w:ascii="Times New Roman" w:hAnsi="Times New Roman"/>
+          <w:sz w:val="24"/>
+          <w:szCs w:val="24"/>
+          <w:lang w:val="pt-BR"/>
+        </w:rPr>
+        <w:t xml:space="preserve">, </w:t>
+      </w:r>
+      <w:r>
+        <w:rPr>
+          <w:rFonts w:ascii="Times New Roman" w:hAnsi="Times New Roman"/>
+          <w:sz w:val="24"/>
+          <w:szCs w:val="24"/>
+        </w:rPr>
+        <w:t>oriunda d</w:t>
+      </w:r>
+      <w:r>
+        <w:rPr>
+          <w:rFonts w:ascii="Times New Roman" w:hAnsi="Times New Roman"/>
+          <w:sz w:val="24"/>
+          <w:szCs w:val="24"/>
+          <w:lang w:val="pt-BR"/>
+        </w:rPr>
+        <w:t xml:space="preserve">o </w:t>
+      </w:r>
+      <w:r>
+        <w:rPr>
+          <w:rFonts w:ascii="Times New Roman" w:hAnsi="Times New Roman"/>
+          <w:color w:val="FF0000"/>
+          <w:sz w:val="24"/>
+          <w:szCs w:val="24"/>
+          <w:lang w:val="pt-BR"/>
+        </w:rPr>
+        <w:t>{</w:t>
+      </w:r>
+      <w:proofErr w:type="spellStart"/>
+      <w:r>
+        <w:rPr>
+          <w:rFonts w:ascii="Times New Roman" w:hAnsi="Times New Roman"/>
+          <w:color w:val="FF0000"/>
+          <w:sz w:val="24"/>
+          <w:szCs w:val="24"/>
+          <w:lang w:val="pt-BR"/>
+        </w:rPr>
+        <w:t>cartorio</w:t>
+      </w:r>
+      <w:proofErr w:type="spellEnd"/>
+      <w:r>
+        <w:rPr>
+          <w:rFonts w:ascii="Times New Roman" w:hAnsi="Times New Roman"/>
+          <w:color w:val="FF0000"/>
+          <w:sz w:val="24"/>
+          <w:szCs w:val="24"/>
+          <w:lang w:val="pt-BR"/>
+        </w:rPr>
+        <w:t>}</w:t>
+      </w:r>
+      <w:r>
+        <w:rPr>
+          <w:rFonts w:ascii="Times New Roman" w:hAnsi="Times New Roman"/>
+          <w:sz w:val="24"/>
+          <w:szCs w:val="24"/>
+          <w:lang w:val="pt-BR"/>
+        </w:rPr>
+        <w:t>,</w:t>
+      </w:r>
+      <w:r>
+        <w:rPr>
+          <w:rFonts w:ascii="Times New Roman" w:hAnsi="Times New Roman"/>
+          <w:sz w:val="24"/>
+          <w:szCs w:val="24"/>
+        </w:rPr>
+        <w:t xml:space="preserve"> de</w:t>
+      </w:r>
+      <w:r>
+        <w:rPr>
+          <w:rFonts w:ascii="Times New Roman" w:hAnsi="Times New Roman"/>
+          <w:sz w:val="24"/>
+          <w:szCs w:val="24"/>
+          <w:lang w:val="pt-BR"/>
+        </w:rPr>
         <w:t xml:space="preserve"> </w:t>
       </w:r>
       <w:r>
@@ -710,7 +822,7 @@
           <w:szCs w:val="24"/>
           <w:lang w:val="pt-BR"/>
         </w:rPr>
-        <w:t>matricula_certidao</w:t>
+        <w:t>nome_filho</w:t>
       </w:r>
       <w:proofErr w:type="spellEnd"/>
       <w:r>
@@ -728,17 +840,17 @@
           <w:rFonts w:ascii="Times New Roman" w:hAnsi="Times New Roman"/>
           <w:sz w:val="24"/>
           <w:szCs w:val="24"/>
+        </w:rPr>
+        <w:t>, nascid</w:t>
+      </w:r>
+      <w:r>
+        <w:rPr>
+          <w:rFonts w:ascii="Times New Roman" w:hAnsi="Times New Roman"/>
+          <w:sz w:val="24"/>
+          <w:szCs w:val="24"/>
           <w:lang w:val="pt-BR"/>
         </w:rPr>
-        <w:t xml:space="preserve">, </w:t>
-      </w:r>
-      <w:r>
-        <w:rPr>
-          <w:rFonts w:ascii="Times New Roman" w:hAnsi="Times New Roman"/>
-          <w:sz w:val="24"/>
-          <w:szCs w:val="24"/>
-        </w:rPr>
-        <w:t>oriunda d</w:t>
+        <w:t>o</w:t>
       </w:r>
       <w:r>
         <w:rPr>
@@ -747,7 +859,15 @@
           <w:szCs w:val="24"/>
           <w:lang w:val="pt-BR"/>
         </w:rPr>
-        <w:t xml:space="preserve">o </w:t>
+        <w:t xml:space="preserve"> (a)</w:t>
+      </w:r>
+      <w:r>
+        <w:rPr>
+          <w:rFonts w:ascii="Times New Roman" w:hAnsi="Times New Roman"/>
+          <w:sz w:val="24"/>
+          <w:szCs w:val="24"/>
+        </w:rPr>
+        <w:t xml:space="preserve"> em </w:t>
       </w:r>
       <w:r>
         <w:rPr>
@@ -768,7 +888,7 @@
           <w:szCs w:val="24"/>
           <w:lang w:val="pt-BR"/>
         </w:rPr>
-        <w:t>cartorio</w:t>
+        <w:t>cidade_natal</w:t>
       </w:r>
       <w:proofErr w:type="spellEnd"/>
       <w:r>
@@ -786,17 +906,17 @@
           <w:rFonts w:ascii="Times New Roman" w:hAnsi="Times New Roman"/>
           <w:sz w:val="24"/>
           <w:szCs w:val="24"/>
+        </w:rPr>
+        <w:t>, filh</w:t>
+      </w:r>
+      <w:r>
+        <w:rPr>
+          <w:rFonts w:ascii="Times New Roman" w:hAnsi="Times New Roman"/>
+          <w:sz w:val="24"/>
+          <w:szCs w:val="24"/>
           <w:lang w:val="pt-BR"/>
         </w:rPr>
-        <w:t>,</w:t>
-      </w:r>
-      <w:r>
-        <w:rPr>
-          <w:rFonts w:ascii="Times New Roman" w:hAnsi="Times New Roman"/>
-          <w:sz w:val="24"/>
-          <w:szCs w:val="24"/>
-        </w:rPr>
-        <w:t xml:space="preserve"> de</w:t>
+        <w:t>o</w:t>
       </w:r>
       <w:r>
         <w:rPr>
@@ -805,114 +925,10 @@
           <w:szCs w:val="24"/>
           <w:lang w:val="pt-BR"/>
         </w:rPr>
-        <w:t xml:space="preserve"> </w:t>
-      </w:r>
-      <w:r>
-        <w:rPr>
-          <w:rFonts w:ascii="Times New Roman" w:hAnsi="Times New Roman"/>
-          <w:color w:val="FF0000"/>
-          <w:sz w:val="24"/>
-          <w:szCs w:val="24"/>
-          <w:lang w:val="pt-BR"/>
-        </w:rPr>
-        <w:t>{</w:t>
-      </w:r>
-      <w:proofErr w:type="spellStart"/>
-      <w:r>
-        <w:rPr>
-          <w:rFonts w:ascii="Times New Roman" w:hAnsi="Times New Roman"/>
-          <w:color w:val="FF0000"/>
-          <w:sz w:val="24"/>
-          <w:szCs w:val="24"/>
-          <w:lang w:val="pt-BR"/>
-        </w:rPr>
-        <w:t>nome_filho</w:t>
-      </w:r>
-      <w:proofErr w:type="spellEnd"/>
-      <w:r>
-        <w:rPr>
-          <w:rFonts w:ascii="Times New Roman" w:hAnsi="Times New Roman"/>
-          <w:color w:val="FF0000"/>
-          <w:sz w:val="24"/>
-          <w:szCs w:val="24"/>
-          <w:lang w:val="pt-BR"/>
-        </w:rPr>
-        <w:t>}</w:t>
-      </w:r>
-      <w:r>
-        <w:rPr>
-          <w:rFonts w:ascii="Times New Roman" w:hAnsi="Times New Roman"/>
-          <w:sz w:val="24"/>
-          <w:szCs w:val="24"/>
-        </w:rPr>
-        <w:t>, nascid</w:t>
-      </w:r>
-      <w:r>
-        <w:rPr>
-          <w:rFonts w:ascii="Times New Roman" w:hAnsi="Times New Roman"/>
-          <w:sz w:val="24"/>
-          <w:szCs w:val="24"/>
-          <w:lang w:val="pt-BR"/>
-        </w:rPr>
-        <w:t>o</w:t>
-      </w:r>
-      <w:r>
-        <w:rPr>
-          <w:rFonts w:ascii="Times New Roman" w:hAnsi="Times New Roman"/>
-          <w:sz w:val="24"/>
-          <w:szCs w:val="24"/>
-        </w:rPr>
-        <w:t xml:space="preserve"> em </w:t>
-      </w:r>
-      <w:r>
-        <w:rPr>
-          <w:rFonts w:ascii="Times New Roman" w:hAnsi="Times New Roman"/>
-          <w:color w:val="FF0000"/>
-          <w:sz w:val="24"/>
-          <w:szCs w:val="24"/>
-          <w:lang w:val="pt-BR"/>
-        </w:rPr>
-        <w:t>{</w:t>
-      </w:r>
-      <w:proofErr w:type="spellStart"/>
-      <w:r>
-        <w:rPr>
-          <w:rFonts w:ascii="Times New Roman" w:hAnsi="Times New Roman"/>
-          <w:color w:val="FF0000"/>
-          <w:sz w:val="24"/>
-          <w:szCs w:val="24"/>
-          <w:lang w:val="pt-BR"/>
-        </w:rPr>
-        <w:t>cidade_natal</w:t>
-      </w:r>
-      <w:proofErr w:type="spellEnd"/>
-      <w:r>
-        <w:rPr>
-          <w:rFonts w:ascii="Times New Roman" w:hAnsi="Times New Roman"/>
-          <w:color w:val="FF0000"/>
-          <w:sz w:val="24"/>
-          <w:szCs w:val="24"/>
-          <w:lang w:val="pt-BR"/>
-        </w:rPr>
-        <w:t>}</w:t>
-      </w:r>
-      <w:r>
-        <w:rPr>
-          <w:rFonts w:ascii="Times New Roman" w:hAnsi="Times New Roman"/>
-          <w:sz w:val="24"/>
-          <w:szCs w:val="24"/>
-        </w:rPr>
-        <w:t>, filh</w:t>
-      </w:r>
-      <w:r>
-        <w:rPr>
-          <w:rFonts w:ascii="Times New Roman" w:hAnsi="Times New Roman"/>
-          <w:sz w:val="24"/>
-          <w:szCs w:val="24"/>
-          <w:lang w:val="pt-BR"/>
-        </w:rPr>
-        <w:t>o</w:t>
-      </w:r>
+        <w:t xml:space="preserve"> (a)</w:t>
+      </w:r>
+      <w:bookmarkStart w:id="0" w:name="_GoBack"/>
+      <w:bookmarkEnd w:id="0"/>
       <w:r>
         <w:rPr>
           <w:rFonts w:ascii="Times New Roman" w:hAnsi="Times New Roman"/>

</xml_diff>